<commit_message>
Failed to create files in "!Готовые работы" due to invalid path Added empty .gitignore file
</commit_message>
<xml_diff>
--- a/!Готовые работы/###Отчет_задание УП06.docx
+++ b/!Готовые работы/###Отчет_задание УП06.docx
@@ -1163,7 +1163,7 @@
           <w:b/>
           <w:bCs/>
         </w:rPr>
-        <w:t>Студенту  группы</w:t>
+        <w:t>Студенту группы __480_____ Семенов Вадим Вячеславович</w:t>
       </w:r>
       <w:proofErr w:type="gramEnd"/>
       <w:r>
@@ -1171,47 +1171,40 @@
           <w:b/>
           <w:bCs/>
         </w:rPr>
-        <w:t xml:space="preserve"> </w:t>
-      </w:r>
-      <w:r>
-        <w:rPr>
-          <w:bCs/>
-        </w:rPr>
-        <w:t>__</w:t>
+      </w:r>
+      <w:r>
+        <w:rPr>
+          <w:bCs/>
+        </w:rPr>
       </w:r>
       <w:r>
         <w:rPr>
           <w:bCs/>
           <w:u w:val="single"/>
         </w:rPr>
-        <w:t>4</w:t>
       </w:r>
       <w:r>
         <w:rPr>
           <w:bCs/>
           <w:u w:val="single"/>
         </w:rPr>
-        <w:t>8</w:t>
       </w:r>
       <w:r>
         <w:rPr>
           <w:bCs/>
           <w:u w:val="single"/>
         </w:rPr>
-        <w:t>0</w:t>
-      </w:r>
-      <w:r>
-        <w:rPr>
-          <w:bCs/>
-        </w:rPr>
-        <w:t xml:space="preserve">_____ </w:t>
-      </w:r>
-      <w:r>
-        <w:rPr>
-          <w:b/>
-          <w:bCs/>
-        </w:rPr>
-        <w:t xml:space="preserve"> </w:t>
+      </w:r>
+      <w:r>
+        <w:rPr>
+          <w:bCs/>
+        </w:rPr>
+      </w:r>
+      <w:r>
+        <w:rPr>
+          <w:b/>
+          <w:bCs/>
+        </w:rPr>
       </w:r>
     </w:p>
     <w:p>

</xml_diff>